<commit_message>
Thêm chức năng lịch sử nghe nhạc vào sơ đồ
</commit_message>
<xml_diff>
--- a/Diagrams/ClassDiagram/DacTaClassDiagram.docx
+++ b/Diagrams/ClassDiagram/DacTaClassDiagram.docx
@@ -5848,12 +5848,6 @@
             <w:insideH w:val="single" w:color="auto" w:sz="4" w:space="0"/>
             <w:insideV w:val="single" w:color="auto" w:sz="4" w:space="0"/>
           </w:tblBorders>
-          <w:tblCellMar>
-            <w:top w:w="0" w:type="dxa"/>
-            <w:left w:w="108" w:type="dxa"/>
-            <w:bottom w:w="0" w:type="dxa"/>
-            <w:right w:w="108" w:type="dxa"/>
-          </w:tblCellMar>
         </w:tblPrEx>
         <w:tc>
           <w:tcPr>
@@ -10633,8 +10627,698 @@
           <w:lang w:val="en-US"/>
         </w:rPr>
       </w:pPr>
-      <w:bookmarkStart w:id="0" w:name="_GoBack"/>
-      <w:bookmarkEnd w:id="0"/>
+    </w:p>
+    <w:p>
+      <w:pPr>
+        <w:rPr>
+          <w:rFonts w:hint="default"/>
+          <w:sz w:val="28"/>
+          <w:szCs w:val="28"/>
+          <w:lang w:val="en-US"/>
+        </w:rPr>
+      </w:pPr>
+      <w:r>
+        <w:rPr>
+          <w:rFonts w:hint="default"/>
+          <w:sz w:val="28"/>
+          <w:szCs w:val="28"/>
+          <w:lang w:val="en-US"/>
+        </w:rPr>
+        <w:t>Class RecentListen</w:t>
+      </w:r>
+    </w:p>
+    <w:tbl>
+      <w:tblPr>
+        <w:tblStyle w:val="4"/>
+        <w:tblW w:w="0" w:type="auto"/>
+        <w:tblInd w:w="0" w:type="dxa"/>
+        <w:tblBorders>
+          <w:top w:val="single" w:color="auto" w:sz="4" w:space="0"/>
+          <w:left w:val="single" w:color="auto" w:sz="4" w:space="0"/>
+          <w:bottom w:val="single" w:color="auto" w:sz="4" w:space="0"/>
+          <w:right w:val="single" w:color="auto" w:sz="4" w:space="0"/>
+          <w:insideH w:val="single" w:color="auto" w:sz="4" w:space="0"/>
+          <w:insideV w:val="single" w:color="auto" w:sz="4" w:space="0"/>
+        </w:tblBorders>
+        <w:tblLayout w:type="autofit"/>
+        <w:tblCellMar>
+          <w:top w:w="0" w:type="dxa"/>
+          <w:left w:w="108" w:type="dxa"/>
+          <w:bottom w:w="0" w:type="dxa"/>
+          <w:right w:w="108" w:type="dxa"/>
+        </w:tblCellMar>
+      </w:tblPr>
+      <w:tblGrid>
+        <w:gridCol w:w="1704"/>
+        <w:gridCol w:w="1704"/>
+        <w:gridCol w:w="1704"/>
+        <w:gridCol w:w="1705"/>
+        <w:gridCol w:w="1705"/>
+      </w:tblGrid>
+      <w:tr>
+        <w:tblPrEx>
+          <w:tblBorders>
+            <w:top w:val="single" w:color="auto" w:sz="4" w:space="0"/>
+            <w:left w:val="single" w:color="auto" w:sz="4" w:space="0"/>
+            <w:bottom w:val="single" w:color="auto" w:sz="4" w:space="0"/>
+            <w:right w:val="single" w:color="auto" w:sz="4" w:space="0"/>
+            <w:insideH w:val="single" w:color="auto" w:sz="4" w:space="0"/>
+            <w:insideV w:val="single" w:color="auto" w:sz="4" w:space="0"/>
+          </w:tblBorders>
+          <w:tblCellMar>
+            <w:top w:w="0" w:type="dxa"/>
+            <w:left w:w="108" w:type="dxa"/>
+            <w:bottom w:w="0" w:type="dxa"/>
+            <w:right w:w="108" w:type="dxa"/>
+          </w:tblCellMar>
+        </w:tblPrEx>
+        <w:tc>
+          <w:tcPr>
+            <w:tcW w:w="1704" w:type="dxa"/>
+          </w:tcPr>
+          <w:p>
+            <w:pPr>
+              <w:widowControl w:val="0"/>
+              <w:jc w:val="both"/>
+              <w:rPr>
+                <w:rFonts w:hint="default"/>
+                <w:sz w:val="28"/>
+                <w:szCs w:val="28"/>
+                <w:vertAlign w:val="baseline"/>
+                <w:lang w:val="en-US"/>
+              </w:rPr>
+            </w:pPr>
+            <w:r>
+              <w:rPr>
+                <w:rFonts w:hint="default"/>
+                <w:sz w:val="28"/>
+                <w:szCs w:val="28"/>
+                <w:vertAlign w:val="baseline"/>
+                <w:lang w:val="en-US"/>
+              </w:rPr>
+              <w:t>Tên thuộc tính</w:t>
+            </w:r>
+          </w:p>
+        </w:tc>
+        <w:tc>
+          <w:tcPr>
+            <w:tcW w:w="1704" w:type="dxa"/>
+          </w:tcPr>
+          <w:p>
+            <w:pPr>
+              <w:widowControl w:val="0"/>
+              <w:jc w:val="both"/>
+              <w:rPr>
+                <w:rFonts w:hint="default"/>
+                <w:sz w:val="28"/>
+                <w:szCs w:val="28"/>
+                <w:vertAlign w:val="baseline"/>
+                <w:lang w:val="en-US"/>
+              </w:rPr>
+            </w:pPr>
+            <w:r>
+              <w:rPr>
+                <w:rFonts w:hint="default"/>
+                <w:sz w:val="28"/>
+                <w:szCs w:val="28"/>
+                <w:vertAlign w:val="baseline"/>
+                <w:lang w:val="en-US"/>
+              </w:rPr>
+              <w:t>Kiểu dữ liệu</w:t>
+            </w:r>
+          </w:p>
+        </w:tc>
+        <w:tc>
+          <w:tcPr>
+            <w:tcW w:w="1704" w:type="dxa"/>
+          </w:tcPr>
+          <w:p>
+            <w:pPr>
+              <w:widowControl w:val="0"/>
+              <w:jc w:val="both"/>
+              <w:rPr>
+                <w:rFonts w:hint="default"/>
+                <w:sz w:val="28"/>
+                <w:szCs w:val="28"/>
+                <w:vertAlign w:val="baseline"/>
+                <w:lang w:val="en-US"/>
+              </w:rPr>
+            </w:pPr>
+            <w:r>
+              <w:rPr>
+                <w:rFonts w:hint="default"/>
+                <w:sz w:val="28"/>
+                <w:szCs w:val="28"/>
+                <w:vertAlign w:val="baseline"/>
+                <w:lang w:val="en-US"/>
+              </w:rPr>
+              <w:t xml:space="preserve">Phạm vi truy cập </w:t>
+            </w:r>
+          </w:p>
+        </w:tc>
+        <w:tc>
+          <w:tcPr>
+            <w:tcW w:w="1705" w:type="dxa"/>
+          </w:tcPr>
+          <w:p>
+            <w:pPr>
+              <w:widowControl w:val="0"/>
+              <w:jc w:val="both"/>
+              <w:rPr>
+                <w:rFonts w:hint="default"/>
+                <w:sz w:val="28"/>
+                <w:szCs w:val="28"/>
+                <w:vertAlign w:val="baseline"/>
+                <w:lang w:val="en-US"/>
+              </w:rPr>
+            </w:pPr>
+            <w:r>
+              <w:rPr>
+                <w:rFonts w:hint="default"/>
+                <w:sz w:val="28"/>
+                <w:szCs w:val="28"/>
+                <w:vertAlign w:val="baseline"/>
+                <w:lang w:val="en-US"/>
+              </w:rPr>
+              <w:t>Mô tả</w:t>
+            </w:r>
+          </w:p>
+        </w:tc>
+        <w:tc>
+          <w:tcPr>
+            <w:tcW w:w="1705" w:type="dxa"/>
+          </w:tcPr>
+          <w:p>
+            <w:pPr>
+              <w:widowControl w:val="0"/>
+              <w:jc w:val="both"/>
+              <w:rPr>
+                <w:rFonts w:hint="default"/>
+                <w:sz w:val="28"/>
+                <w:szCs w:val="28"/>
+                <w:vertAlign w:val="baseline"/>
+                <w:lang w:val="en-US"/>
+              </w:rPr>
+            </w:pPr>
+            <w:r>
+              <w:rPr>
+                <w:rFonts w:hint="default"/>
+                <w:sz w:val="28"/>
+                <w:szCs w:val="28"/>
+                <w:vertAlign w:val="baseline"/>
+                <w:lang w:val="en-US"/>
+              </w:rPr>
+              <w:t>Giá trị khởi tạo/Ràng buộc</w:t>
+            </w:r>
+          </w:p>
+        </w:tc>
+      </w:tr>
+      <w:tr>
+        <w:tblPrEx>
+          <w:tblBorders>
+            <w:top w:val="single" w:color="auto" w:sz="4" w:space="0"/>
+            <w:left w:val="single" w:color="auto" w:sz="4" w:space="0"/>
+            <w:bottom w:val="single" w:color="auto" w:sz="4" w:space="0"/>
+            <w:right w:val="single" w:color="auto" w:sz="4" w:space="0"/>
+            <w:insideH w:val="single" w:color="auto" w:sz="4" w:space="0"/>
+            <w:insideV w:val="single" w:color="auto" w:sz="4" w:space="0"/>
+          </w:tblBorders>
+          <w:tblCellMar>
+            <w:top w:w="0" w:type="dxa"/>
+            <w:left w:w="108" w:type="dxa"/>
+            <w:bottom w:w="0" w:type="dxa"/>
+            <w:right w:w="108" w:type="dxa"/>
+          </w:tblCellMar>
+        </w:tblPrEx>
+        <w:tc>
+          <w:tcPr>
+            <w:tcW w:w="1704" w:type="dxa"/>
+          </w:tcPr>
+          <w:p>
+            <w:pPr>
+              <w:widowControl w:val="0"/>
+              <w:jc w:val="both"/>
+              <w:rPr>
+                <w:rFonts w:hint="default"/>
+                <w:sz w:val="28"/>
+                <w:szCs w:val="28"/>
+                <w:vertAlign w:val="baseline"/>
+                <w:lang w:val="en-US"/>
+              </w:rPr>
+            </w:pPr>
+            <w:r>
+              <w:rPr>
+                <w:rFonts w:hint="default"/>
+                <w:sz w:val="28"/>
+                <w:szCs w:val="28"/>
+                <w:vertAlign w:val="baseline"/>
+                <w:lang w:val="en-US"/>
+              </w:rPr>
+              <w:t>id</w:t>
+            </w:r>
+          </w:p>
+        </w:tc>
+        <w:tc>
+          <w:tcPr>
+            <w:tcW w:w="1704" w:type="dxa"/>
+          </w:tcPr>
+          <w:p>
+            <w:pPr>
+              <w:widowControl w:val="0"/>
+              <w:jc w:val="both"/>
+              <w:rPr>
+                <w:rFonts w:hint="default"/>
+                <w:sz w:val="28"/>
+                <w:szCs w:val="28"/>
+                <w:vertAlign w:val="baseline"/>
+                <w:lang w:val="en-US"/>
+              </w:rPr>
+            </w:pPr>
+            <w:r>
+              <w:rPr>
+                <w:rFonts w:hint="default"/>
+                <w:sz w:val="28"/>
+                <w:szCs w:val="28"/>
+                <w:vertAlign w:val="baseline"/>
+                <w:lang w:val="en-US"/>
+              </w:rPr>
+              <w:t>string</w:t>
+            </w:r>
+          </w:p>
+        </w:tc>
+        <w:tc>
+          <w:tcPr>
+            <w:tcW w:w="1704" w:type="dxa"/>
+          </w:tcPr>
+          <w:p>
+            <w:pPr>
+              <w:widowControl w:val="0"/>
+              <w:jc w:val="both"/>
+              <w:rPr>
+                <w:rFonts w:hint="default"/>
+                <w:sz w:val="28"/>
+                <w:szCs w:val="28"/>
+                <w:vertAlign w:val="baseline"/>
+                <w:lang w:val="en-US"/>
+              </w:rPr>
+            </w:pPr>
+            <w:r>
+              <w:rPr>
+                <w:rFonts w:hint="default"/>
+                <w:sz w:val="28"/>
+                <w:szCs w:val="28"/>
+                <w:vertAlign w:val="baseline"/>
+                <w:lang w:val="en-US"/>
+              </w:rPr>
+              <w:t>private</w:t>
+            </w:r>
+          </w:p>
+        </w:tc>
+        <w:tc>
+          <w:tcPr>
+            <w:tcW w:w="1705" w:type="dxa"/>
+          </w:tcPr>
+          <w:p>
+            <w:pPr>
+              <w:widowControl w:val="0"/>
+              <w:jc w:val="both"/>
+              <w:rPr>
+                <w:rFonts w:hint="default"/>
+                <w:sz w:val="28"/>
+                <w:szCs w:val="28"/>
+                <w:vertAlign w:val="baseline"/>
+                <w:lang w:val="en-US"/>
+              </w:rPr>
+            </w:pPr>
+            <w:r>
+              <w:rPr>
+                <w:rFonts w:hint="default"/>
+                <w:sz w:val="28"/>
+                <w:szCs w:val="28"/>
+                <w:vertAlign w:val="baseline"/>
+                <w:lang w:val="en-US"/>
+              </w:rPr>
+              <w:t>Mã định danh</w:t>
+            </w:r>
+          </w:p>
+        </w:tc>
+        <w:tc>
+          <w:tcPr>
+            <w:tcW w:w="1705" w:type="dxa"/>
+          </w:tcPr>
+          <w:p>
+            <w:pPr>
+              <w:widowControl w:val="0"/>
+              <w:jc w:val="both"/>
+              <w:rPr>
+                <w:rFonts w:hint="default"/>
+                <w:sz w:val="28"/>
+                <w:szCs w:val="28"/>
+                <w:vertAlign w:val="baseline"/>
+                <w:lang w:val="en-US"/>
+              </w:rPr>
+            </w:pPr>
+            <w:r>
+              <w:rPr>
+                <w:rFonts w:hint="default"/>
+                <w:sz w:val="28"/>
+                <w:szCs w:val="28"/>
+                <w:vertAlign w:val="baseline"/>
+                <w:lang w:val="en-US"/>
+              </w:rPr>
+              <w:t>&gt;0 và NOT NULL</w:t>
+            </w:r>
+          </w:p>
+        </w:tc>
+      </w:tr>
+      <w:tr>
+        <w:tblPrEx>
+          <w:tblBorders>
+            <w:top w:val="single" w:color="auto" w:sz="4" w:space="0"/>
+            <w:left w:val="single" w:color="auto" w:sz="4" w:space="0"/>
+            <w:bottom w:val="single" w:color="auto" w:sz="4" w:space="0"/>
+            <w:right w:val="single" w:color="auto" w:sz="4" w:space="0"/>
+            <w:insideH w:val="single" w:color="auto" w:sz="4" w:space="0"/>
+            <w:insideV w:val="single" w:color="auto" w:sz="4" w:space="0"/>
+          </w:tblBorders>
+          <w:tblCellMar>
+            <w:top w:w="0" w:type="dxa"/>
+            <w:left w:w="108" w:type="dxa"/>
+            <w:bottom w:w="0" w:type="dxa"/>
+            <w:right w:w="108" w:type="dxa"/>
+          </w:tblCellMar>
+        </w:tblPrEx>
+        <w:tc>
+          <w:tcPr>
+            <w:tcW w:w="1704" w:type="dxa"/>
+          </w:tcPr>
+          <w:p>
+            <w:pPr>
+              <w:widowControl w:val="0"/>
+              <w:jc w:val="both"/>
+              <w:rPr>
+                <w:rFonts w:hint="default"/>
+                <w:sz w:val="28"/>
+                <w:szCs w:val="28"/>
+                <w:vertAlign w:val="baseline"/>
+                <w:lang w:val="en-US"/>
+              </w:rPr>
+            </w:pPr>
+            <w:r>
+              <w:rPr>
+                <w:rFonts w:hint="default"/>
+                <w:sz w:val="28"/>
+                <w:szCs w:val="28"/>
+                <w:vertAlign w:val="baseline"/>
+                <w:lang w:val="en-US"/>
+              </w:rPr>
+              <w:t>lastPlayedAt</w:t>
+            </w:r>
+          </w:p>
+        </w:tc>
+        <w:tc>
+          <w:tcPr>
+            <w:tcW w:w="1704" w:type="dxa"/>
+          </w:tcPr>
+          <w:p>
+            <w:pPr>
+              <w:widowControl w:val="0"/>
+              <w:jc w:val="both"/>
+              <w:rPr>
+                <w:rFonts w:hint="default"/>
+                <w:sz w:val="28"/>
+                <w:szCs w:val="28"/>
+                <w:vertAlign w:val="baseline"/>
+                <w:lang w:val="en-US"/>
+              </w:rPr>
+            </w:pPr>
+            <w:r>
+              <w:rPr>
+                <w:rFonts w:hint="default"/>
+                <w:sz w:val="28"/>
+                <w:szCs w:val="28"/>
+                <w:vertAlign w:val="baseline"/>
+                <w:lang w:val="en-US"/>
+              </w:rPr>
+              <w:t>string</w:t>
+            </w:r>
+          </w:p>
+        </w:tc>
+        <w:tc>
+          <w:tcPr>
+            <w:tcW w:w="1704" w:type="dxa"/>
+          </w:tcPr>
+          <w:p>
+            <w:pPr>
+              <w:widowControl w:val="0"/>
+              <w:jc w:val="both"/>
+              <w:rPr>
+                <w:rFonts w:hint="default"/>
+                <w:sz w:val="28"/>
+                <w:szCs w:val="28"/>
+                <w:vertAlign w:val="baseline"/>
+                <w:lang w:val="en-US"/>
+              </w:rPr>
+            </w:pPr>
+            <w:r>
+              <w:rPr>
+                <w:rFonts w:hint="default"/>
+                <w:sz w:val="28"/>
+                <w:szCs w:val="28"/>
+                <w:vertAlign w:val="baseline"/>
+                <w:lang w:val="en-US"/>
+              </w:rPr>
+              <w:t>private</w:t>
+            </w:r>
+          </w:p>
+        </w:tc>
+        <w:tc>
+          <w:tcPr>
+            <w:tcW w:w="1705" w:type="dxa"/>
+          </w:tcPr>
+          <w:p>
+            <w:pPr>
+              <w:widowControl w:val="0"/>
+              <w:jc w:val="both"/>
+              <w:rPr>
+                <w:rFonts w:hint="default"/>
+                <w:sz w:val="28"/>
+                <w:szCs w:val="28"/>
+                <w:vertAlign w:val="baseline"/>
+                <w:lang w:val="en-US"/>
+              </w:rPr>
+            </w:pPr>
+            <w:r>
+              <w:rPr>
+                <w:rFonts w:hint="default"/>
+                <w:sz w:val="28"/>
+                <w:szCs w:val="28"/>
+                <w:vertAlign w:val="baseline"/>
+                <w:lang w:val="en-US"/>
+              </w:rPr>
+              <w:t>Lần cuối được nghe</w:t>
+            </w:r>
+          </w:p>
+        </w:tc>
+        <w:tc>
+          <w:tcPr>
+            <w:tcW w:w="1705" w:type="dxa"/>
+          </w:tcPr>
+          <w:p>
+            <w:pPr>
+              <w:widowControl w:val="0"/>
+              <w:jc w:val="both"/>
+              <w:rPr>
+                <w:rFonts w:hint="default"/>
+                <w:sz w:val="28"/>
+                <w:szCs w:val="28"/>
+                <w:vertAlign w:val="baseline"/>
+                <w:lang w:val="en-US"/>
+              </w:rPr>
+            </w:pPr>
+            <w:r>
+              <w:rPr>
+                <w:rFonts w:hint="default"/>
+                <w:sz w:val="28"/>
+                <w:szCs w:val="28"/>
+                <w:vertAlign w:val="baseline"/>
+                <w:lang w:val="en-US"/>
+              </w:rPr>
+              <w:t>Thời gian hiện tại</w:t>
+            </w:r>
+            <w:bookmarkStart w:id="0" w:name="_GoBack"/>
+            <w:bookmarkEnd w:id="0"/>
+          </w:p>
+        </w:tc>
+      </w:tr>
+      <w:tr>
+        <w:tblPrEx>
+          <w:tblBorders>
+            <w:top w:val="single" w:color="auto" w:sz="4" w:space="0"/>
+            <w:left w:val="single" w:color="auto" w:sz="4" w:space="0"/>
+            <w:bottom w:val="single" w:color="auto" w:sz="4" w:space="0"/>
+            <w:right w:val="single" w:color="auto" w:sz="4" w:space="0"/>
+            <w:insideH w:val="single" w:color="auto" w:sz="4" w:space="0"/>
+            <w:insideV w:val="single" w:color="auto" w:sz="4" w:space="0"/>
+          </w:tblBorders>
+          <w:tblCellMar>
+            <w:top w:w="0" w:type="dxa"/>
+            <w:left w:w="108" w:type="dxa"/>
+            <w:bottom w:w="0" w:type="dxa"/>
+            <w:right w:w="108" w:type="dxa"/>
+          </w:tblCellMar>
+        </w:tblPrEx>
+        <w:tc>
+          <w:tcPr>
+            <w:tcW w:w="1704" w:type="dxa"/>
+          </w:tcPr>
+          <w:p>
+            <w:pPr>
+              <w:widowControl w:val="0"/>
+              <w:jc w:val="both"/>
+              <w:rPr>
+                <w:rFonts w:hint="default"/>
+                <w:sz w:val="28"/>
+                <w:szCs w:val="28"/>
+                <w:vertAlign w:val="baseline"/>
+                <w:lang w:val="en-US"/>
+              </w:rPr>
+            </w:pPr>
+            <w:r>
+              <w:rPr>
+                <w:rFonts w:hint="default"/>
+                <w:sz w:val="28"/>
+                <w:szCs w:val="28"/>
+                <w:vertAlign w:val="baseline"/>
+                <w:lang w:val="en-US"/>
+              </w:rPr>
+              <w:t>playCount</w:t>
+            </w:r>
+          </w:p>
+        </w:tc>
+        <w:tc>
+          <w:tcPr>
+            <w:tcW w:w="1704" w:type="dxa"/>
+          </w:tcPr>
+          <w:p>
+            <w:pPr>
+              <w:widowControl w:val="0"/>
+              <w:jc w:val="both"/>
+              <w:rPr>
+                <w:rFonts w:hint="default"/>
+                <w:sz w:val="28"/>
+                <w:szCs w:val="28"/>
+                <w:vertAlign w:val="baseline"/>
+                <w:lang w:val="en-US"/>
+              </w:rPr>
+            </w:pPr>
+            <w:r>
+              <w:rPr>
+                <w:rFonts w:hint="default"/>
+                <w:sz w:val="28"/>
+                <w:szCs w:val="28"/>
+                <w:vertAlign w:val="baseline"/>
+                <w:lang w:val="en-US"/>
+              </w:rPr>
+              <w:t>number</w:t>
+            </w:r>
+          </w:p>
+        </w:tc>
+        <w:tc>
+          <w:tcPr>
+            <w:tcW w:w="1704" w:type="dxa"/>
+          </w:tcPr>
+          <w:p>
+            <w:pPr>
+              <w:widowControl w:val="0"/>
+              <w:jc w:val="both"/>
+              <w:rPr>
+                <w:rFonts w:hint="default"/>
+                <w:sz w:val="28"/>
+                <w:szCs w:val="28"/>
+                <w:vertAlign w:val="baseline"/>
+                <w:lang w:val="en-US"/>
+              </w:rPr>
+            </w:pPr>
+            <w:r>
+              <w:rPr>
+                <w:rFonts w:hint="default"/>
+                <w:sz w:val="28"/>
+                <w:szCs w:val="28"/>
+                <w:vertAlign w:val="baseline"/>
+                <w:lang w:val="en-US"/>
+              </w:rPr>
+              <w:t>private</w:t>
+            </w:r>
+          </w:p>
+        </w:tc>
+        <w:tc>
+          <w:tcPr>
+            <w:tcW w:w="1705" w:type="dxa"/>
+          </w:tcPr>
+          <w:p>
+            <w:pPr>
+              <w:widowControl w:val="0"/>
+              <w:jc w:val="both"/>
+              <w:rPr>
+                <w:rFonts w:hint="default"/>
+                <w:sz w:val="28"/>
+                <w:szCs w:val="28"/>
+                <w:vertAlign w:val="baseline"/>
+                <w:lang w:val="en-US"/>
+              </w:rPr>
+            </w:pPr>
+            <w:r>
+              <w:rPr>
+                <w:rFonts w:hint="default"/>
+                <w:sz w:val="28"/>
+                <w:szCs w:val="28"/>
+                <w:vertAlign w:val="baseline"/>
+                <w:lang w:val="en-US"/>
+              </w:rPr>
+              <w:t>Số lượt nghe</w:t>
+            </w:r>
+          </w:p>
+        </w:tc>
+        <w:tc>
+          <w:tcPr>
+            <w:tcW w:w="1705" w:type="dxa"/>
+          </w:tcPr>
+          <w:p>
+            <w:pPr>
+              <w:widowControl w:val="0"/>
+              <w:jc w:val="both"/>
+              <w:rPr>
+                <w:rFonts w:hint="default"/>
+                <w:sz w:val="28"/>
+                <w:szCs w:val="28"/>
+                <w:vertAlign w:val="baseline"/>
+                <w:lang w:val="en-US"/>
+              </w:rPr>
+            </w:pPr>
+            <w:r>
+              <w:rPr>
+                <w:rFonts w:hint="default"/>
+                <w:sz w:val="28"/>
+                <w:szCs w:val="28"/>
+                <w:vertAlign w:val="baseline"/>
+                <w:lang w:val="en-US"/>
+              </w:rPr>
+              <w:t>1</w:t>
+            </w:r>
+          </w:p>
+        </w:tc>
+      </w:tr>
+    </w:tbl>
+    <w:p>
+      <w:pPr>
+        <w:rPr>
+          <w:rFonts w:hint="default"/>
+          <w:sz w:val="28"/>
+          <w:szCs w:val="28"/>
+          <w:lang w:val="en-US"/>
+        </w:rPr>
+      </w:pPr>
     </w:p>
     <w:sectPr>
       <w:pgSz w:w="11906" w:h="16838"/>

</xml_diff>